<commit_message>
feat(doc): completando la guia
</commit_message>
<xml_diff>
--- a/guia_estudiante_taller.docx
+++ b/guia_estudiante_taller.docx
@@ -2831,7 +2831,9 @@
           </w:tcPr>
           <w:p>
             <w:pPr>
-              <w:rPr>
+              <w:pStyle w:val="NormalWeb"/>
+              <w:rPr>
+                <w:rFonts w:ascii="Arial" w:hAnsi="Arial" w:cs="Arial"/>
                 <w:sz w:val="19"/>
                 <w:szCs w:val="19"/>
               </w:rPr>
@@ -2839,18 +2841,113 @@
             <w:proofErr w:type="spellStart"/>
             <w:r>
               <w:rPr>
-                <w:sz w:val="19"/>
-                <w:szCs w:val="19"/>
-              </w:rPr>
-              <w:t>Arrays</w:t>
+                <w:rStyle w:val="citation-139"/>
+                <w:rFonts w:ascii="Arial" w:hAnsi="Arial" w:cs="Arial"/>
+                <w:sz w:val="19"/>
+                <w:szCs w:val="19"/>
+              </w:rPr>
+              <w:t>String</w:t>
             </w:r>
             <w:proofErr w:type="spellEnd"/>
             <w:r>
               <w:rPr>
-                <w:sz w:val="19"/>
-                <w:szCs w:val="19"/>
-              </w:rPr>
-              <w:t xml:space="preserve"> declarados de forma poco entendible. Violando el patrón 4</w:t>
+                <w:rStyle w:val="citation-139"/>
+                <w:rFonts w:ascii="Arial" w:hAnsi="Arial" w:cs="Arial"/>
+                <w:sz w:val="19"/>
+                <w:szCs w:val="19"/>
+              </w:rPr>
+              <w:t xml:space="preserve"> </w:t>
+            </w:r>
+            <w:proofErr w:type="spellStart"/>
+            <w:proofErr w:type="gramStart"/>
+            <w:r>
+              <w:rPr>
+                <w:rStyle w:val="citation-139"/>
+                <w:rFonts w:ascii="Arial" w:hAnsi="Arial" w:cs="Arial"/>
+                <w:sz w:val="19"/>
+                <w:szCs w:val="19"/>
+              </w:rPr>
+              <w:t>nom</w:t>
+            </w:r>
+            <w:proofErr w:type="spellEnd"/>
+            <w:r>
+              <w:rPr>
+                <w:rStyle w:val="citation-139"/>
+                <w:rFonts w:ascii="Arial" w:hAnsi="Arial" w:cs="Arial"/>
+                <w:sz w:val="19"/>
+                <w:szCs w:val="19"/>
+              </w:rPr>
+              <w:t>[</w:t>
+            </w:r>
+            <w:proofErr w:type="gramEnd"/>
+            <w:r>
+              <w:rPr>
+                <w:rStyle w:val="citation-139"/>
+                <w:rFonts w:ascii="Arial" w:hAnsi="Arial" w:cs="Arial"/>
+                <w:sz w:val="19"/>
+                <w:szCs w:val="19"/>
+              </w:rPr>
+              <w:t xml:space="preserve">], </w:t>
+            </w:r>
+            <w:proofErr w:type="spellStart"/>
+            <w:r>
+              <w:rPr>
+                <w:rStyle w:val="citation-139"/>
+                <w:rFonts w:ascii="Arial" w:hAnsi="Arial" w:cs="Arial"/>
+                <w:sz w:val="19"/>
+                <w:szCs w:val="19"/>
+              </w:rPr>
+              <w:t>double</w:t>
+            </w:r>
+            <w:proofErr w:type="spellEnd"/>
+            <w:r>
+              <w:rPr>
+                <w:rStyle w:val="citation-139"/>
+                <w:rFonts w:ascii="Arial" w:hAnsi="Arial" w:cs="Arial"/>
+                <w:sz w:val="19"/>
+                <w:szCs w:val="19"/>
+              </w:rPr>
+              <w:t xml:space="preserve"> p[], </w:t>
+            </w:r>
+            <w:proofErr w:type="spellStart"/>
+            <w:r>
+              <w:rPr>
+                <w:rStyle w:val="citation-139"/>
+                <w:rFonts w:ascii="Arial" w:hAnsi="Arial" w:cs="Arial"/>
+                <w:sz w:val="19"/>
+                <w:szCs w:val="19"/>
+              </w:rPr>
+              <w:t>int</w:t>
+            </w:r>
+            <w:proofErr w:type="spellEnd"/>
+            <w:r>
+              <w:rPr>
+                <w:rStyle w:val="citation-139"/>
+                <w:rFonts w:ascii="Arial" w:hAnsi="Arial" w:cs="Arial"/>
+                <w:sz w:val="19"/>
+                <w:szCs w:val="19"/>
+              </w:rPr>
+              <w:t xml:space="preserve"> </w:t>
+            </w:r>
+            <w:proofErr w:type="spellStart"/>
+            <w:r>
+              <w:rPr>
+                <w:rStyle w:val="citation-139"/>
+                <w:rFonts w:ascii="Arial" w:hAnsi="Arial" w:cs="Arial"/>
+                <w:sz w:val="19"/>
+                <w:szCs w:val="19"/>
+              </w:rPr>
+              <w:t>cant</w:t>
+            </w:r>
+            <w:proofErr w:type="spellEnd"/>
+            <w:r>
+              <w:rPr>
+                <w:rStyle w:val="citation-139"/>
+                <w:rFonts w:ascii="Arial" w:hAnsi="Arial" w:cs="Arial"/>
+                <w:sz w:val="19"/>
+                <w:szCs w:val="19"/>
+              </w:rPr>
+              <w:t>[] representan un producto pero están separados.</w:t>
             </w:r>
           </w:p>
         </w:tc>
@@ -3001,10 +3098,47 @@
             </w:pPr>
             <w:r>
               <w:rPr>
-                <w:sz w:val="19"/>
-                <w:szCs w:val="19"/>
-              </w:rPr>
-              <w:t>Sin encapsulamiento. Mala práctica y poco segura</w:t>
+                <w:rStyle w:val="citation-138"/>
+                <w:sz w:val="19"/>
+                <w:szCs w:val="19"/>
+              </w:rPr>
+              <w:t xml:space="preserve">Variables como </w:t>
+            </w:r>
+            <w:proofErr w:type="spellStart"/>
+            <w:r>
+              <w:rPr>
+                <w:rStyle w:val="citation-138"/>
+                <w:sz w:val="19"/>
+                <w:szCs w:val="19"/>
+              </w:rPr>
+              <w:t>tot</w:t>
+            </w:r>
+            <w:proofErr w:type="spellEnd"/>
+            <w:r>
+              <w:rPr>
+                <w:rStyle w:val="citation-138"/>
+                <w:sz w:val="19"/>
+                <w:szCs w:val="19"/>
+              </w:rPr>
+              <w:t xml:space="preserve">, ms, </w:t>
+            </w:r>
+            <w:proofErr w:type="spellStart"/>
+            <w:r>
+              <w:rPr>
+                <w:rStyle w:val="citation-138"/>
+                <w:sz w:val="19"/>
+                <w:szCs w:val="19"/>
+              </w:rPr>
+              <w:t>est</w:t>
+            </w:r>
+            <w:proofErr w:type="spellEnd"/>
+            <w:r>
+              <w:rPr>
+                <w:rStyle w:val="citation-138"/>
+                <w:sz w:val="19"/>
+                <w:szCs w:val="19"/>
+              </w:rPr>
+              <w:t xml:space="preserve"> son globales; cualquiera puede alterarlas sin control.</w:t>
             </w:r>
           </w:p>
         </w:tc>
@@ -3130,17 +3264,32 @@
           </w:tcPr>
           <w:p>
             <w:pPr>
-              <w:rPr>
+              <w:pStyle w:val="NormalWeb"/>
+              <w:rPr>
+                <w:rFonts w:ascii="Arial" w:hAnsi="Arial" w:cs="Arial"/>
                 <w:sz w:val="19"/>
                 <w:szCs w:val="19"/>
               </w:rPr>
             </w:pPr>
-            <w:r>
-              <w:rPr>
-                <w:sz w:val="19"/>
-                <w:szCs w:val="19"/>
-              </w:rPr>
-              <w:t xml:space="preserve">Debería ser constante. Violación del patrón8 </w:t>
+            <w:proofErr w:type="spellStart"/>
+            <w:r>
+              <w:rPr>
+                <w:rStyle w:val="citation-137"/>
+                <w:rFonts w:ascii="Arial" w:hAnsi="Arial" w:cs="Arial"/>
+                <w:sz w:val="19"/>
+                <w:szCs w:val="19"/>
+              </w:rPr>
+              <w:t>String</w:t>
+            </w:r>
+            <w:proofErr w:type="spellEnd"/>
+            <w:r>
+              <w:rPr>
+                <w:rStyle w:val="citation-137"/>
+                <w:rFonts w:ascii="Arial" w:hAnsi="Arial" w:cs="Arial"/>
+                <w:sz w:val="19"/>
+                <w:szCs w:val="19"/>
+              </w:rPr>
+              <w:t xml:space="preserve"> x = "El Buen Sabor"; el nombre está en una variable poco descriptiva.</w:t>
             </w:r>
           </w:p>
         </w:tc>
@@ -3274,17 +3423,92 @@
           </w:tcPr>
           <w:p>
             <w:pPr>
-              <w:rPr>
+              <w:pStyle w:val="NormalWeb"/>
+              <w:rPr>
+                <w:rFonts w:ascii="Arial" w:hAnsi="Arial" w:cs="Arial"/>
                 <w:sz w:val="19"/>
                 <w:szCs w:val="19"/>
               </w:rPr>
             </w:pPr>
-            <w:r>
-              <w:rPr>
-                <w:sz w:val="19"/>
-                <w:szCs w:val="19"/>
-              </w:rPr>
-              <w:t>Variable sin sentido que no cumple ninguna función</w:t>
+            <w:proofErr w:type="spellStart"/>
+            <w:r>
+              <w:rPr>
+                <w:rStyle w:val="citation-136"/>
+                <w:rFonts w:ascii="Arial" w:hAnsi="Arial" w:cs="Arial"/>
+                <w:sz w:val="19"/>
+                <w:szCs w:val="19"/>
+              </w:rPr>
+              <w:t>public</w:t>
+            </w:r>
+            <w:proofErr w:type="spellEnd"/>
+            <w:r>
+              <w:rPr>
+                <w:rStyle w:val="citation-136"/>
+                <w:rFonts w:ascii="Arial" w:hAnsi="Arial" w:cs="Arial"/>
+                <w:sz w:val="19"/>
+                <w:szCs w:val="19"/>
+              </w:rPr>
+              <w:t xml:space="preserve"> </w:t>
+            </w:r>
+            <w:proofErr w:type="spellStart"/>
+            <w:r>
+              <w:rPr>
+                <w:rStyle w:val="citation-136"/>
+                <w:rFonts w:ascii="Arial" w:hAnsi="Arial" w:cs="Arial"/>
+                <w:sz w:val="19"/>
+                <w:szCs w:val="19"/>
+              </w:rPr>
+              <w:t>static</w:t>
+            </w:r>
+            <w:proofErr w:type="spellEnd"/>
+            <w:r>
+              <w:rPr>
+                <w:rStyle w:val="citation-136"/>
+                <w:rFonts w:ascii="Arial" w:hAnsi="Arial" w:cs="Arial"/>
+                <w:sz w:val="19"/>
+                <w:szCs w:val="19"/>
+              </w:rPr>
+              <w:t xml:space="preserve"> </w:t>
+            </w:r>
+            <w:proofErr w:type="spellStart"/>
+            <w:r>
+              <w:rPr>
+                <w:rStyle w:val="citation-136"/>
+                <w:rFonts w:ascii="Arial" w:hAnsi="Arial" w:cs="Arial"/>
+                <w:sz w:val="19"/>
+                <w:szCs w:val="19"/>
+              </w:rPr>
+              <w:t>String</w:t>
+            </w:r>
+            <w:proofErr w:type="spellEnd"/>
+            <w:r>
+              <w:rPr>
+                <w:rStyle w:val="citation-136"/>
+                <w:rFonts w:ascii="Arial" w:hAnsi="Arial" w:cs="Arial"/>
+                <w:sz w:val="19"/>
+                <w:szCs w:val="19"/>
+              </w:rPr>
+              <w:t xml:space="preserve"> </w:t>
+            </w:r>
+            <w:proofErr w:type="spellStart"/>
+            <w:r>
+              <w:rPr>
+                <w:rStyle w:val="citation-136"/>
+                <w:rFonts w:ascii="Arial" w:hAnsi="Arial" w:cs="Arial"/>
+                <w:sz w:val="19"/>
+                <w:szCs w:val="19"/>
+              </w:rPr>
+              <w:t>tmp</w:t>
+            </w:r>
+            <w:proofErr w:type="spellEnd"/>
+            <w:r>
+              <w:rPr>
+                <w:rStyle w:val="citation-136"/>
+                <w:rFonts w:ascii="Arial" w:hAnsi="Arial" w:cs="Arial"/>
+                <w:sz w:val="19"/>
+                <w:szCs w:val="19"/>
+              </w:rPr>
+              <w:t xml:space="preserve">; se usa globalmente para algo que debería ser local. </w:t>
             </w:r>
           </w:p>
         </w:tc>
@@ -3400,17 +3624,21 @@
           </w:tcPr>
           <w:p>
             <w:pPr>
-              <w:rPr>
+              <w:pStyle w:val="NormalWeb"/>
+              <w:rPr>
+                <w:rFonts w:ascii="Arial" w:hAnsi="Arial" w:cs="Arial"/>
                 <w:sz w:val="19"/>
                 <w:szCs w:val="19"/>
               </w:rPr>
             </w:pPr>
             <w:r>
               <w:rPr>
-                <w:sz w:val="19"/>
-                <w:szCs w:val="19"/>
-              </w:rPr>
-              <w:t xml:space="preserve">No cumple con las normas de POO. Mala práctica y muy ineficiente </w:t>
+                <w:rStyle w:val="citation-135"/>
+                <w:rFonts w:ascii="Arial" w:hAnsi="Arial" w:cs="Arial"/>
+                <w:sz w:val="19"/>
+                <w:szCs w:val="19"/>
+              </w:rPr>
+              <w:t>La clase no tiene comportamiento, solo es un almacén de datos desprotegido.</w:t>
             </w:r>
           </w:p>
         </w:tc>
@@ -3434,6 +3662,12 @@
             </w:tcMar>
           </w:tcPr>
           <w:p>
+            <w:pPr>
+              <w:rPr>
+                <w:sz w:val="19"/>
+                <w:szCs w:val="19"/>
+              </w:rPr>
+            </w:pPr>
             <w:r>
               <w:rPr>
                 <w:b/>
@@ -3464,6 +3698,12 @@
             </w:tcMar>
           </w:tcPr>
           <w:p>
+            <w:pPr>
+              <w:rPr>
+                <w:sz w:val="19"/>
+                <w:szCs w:val="19"/>
+              </w:rPr>
+            </w:pPr>
             <w:r>
               <w:rPr>
                 <w:color w:val="1A1A1A"/>
@@ -3526,17 +3766,81 @@
           </w:tcPr>
           <w:p>
             <w:pPr>
-              <w:rPr>
+              <w:pStyle w:val="NormalWeb"/>
+              <w:rPr>
+                <w:rFonts w:ascii="Arial" w:hAnsi="Arial" w:cs="Arial"/>
                 <w:sz w:val="19"/>
                 <w:szCs w:val="19"/>
               </w:rPr>
             </w:pPr>
             <w:r>
               <w:rPr>
-                <w:sz w:val="19"/>
-                <w:szCs w:val="19"/>
-              </w:rPr>
-              <w:t>Nombres muy confusos y no dejan muy en claro que significan. Incumplimiento del patrón 1</w:t>
+                <w:rStyle w:val="citation-134"/>
+                <w:rFonts w:ascii="Arial" w:hAnsi="Arial" w:cs="Arial"/>
+                <w:sz w:val="19"/>
+                <w:szCs w:val="19"/>
+              </w:rPr>
+              <w:t xml:space="preserve">ms, </w:t>
+            </w:r>
+            <w:proofErr w:type="spellStart"/>
+            <w:r>
+              <w:rPr>
+                <w:rStyle w:val="citation-134"/>
+                <w:rFonts w:ascii="Arial" w:hAnsi="Arial" w:cs="Arial"/>
+                <w:sz w:val="19"/>
+                <w:szCs w:val="19"/>
+              </w:rPr>
+              <w:t>est</w:t>
+            </w:r>
+            <w:proofErr w:type="spellEnd"/>
+            <w:r>
+              <w:rPr>
+                <w:rStyle w:val="citation-134"/>
+                <w:rFonts w:ascii="Arial" w:hAnsi="Arial" w:cs="Arial"/>
+                <w:sz w:val="19"/>
+                <w:szCs w:val="19"/>
+              </w:rPr>
+              <w:t xml:space="preserve">, </w:t>
+            </w:r>
+            <w:proofErr w:type="spellStart"/>
+            <w:r>
+              <w:rPr>
+                <w:rStyle w:val="citation-134"/>
+                <w:rFonts w:ascii="Arial" w:hAnsi="Arial" w:cs="Arial"/>
+                <w:sz w:val="19"/>
+                <w:szCs w:val="19"/>
+              </w:rPr>
+              <w:t>tot</w:t>
+            </w:r>
+            <w:proofErr w:type="spellEnd"/>
+            <w:r>
+              <w:rPr>
+                <w:rStyle w:val="citation-134"/>
+                <w:rFonts w:ascii="Arial" w:hAnsi="Arial" w:cs="Arial"/>
+                <w:sz w:val="19"/>
+                <w:szCs w:val="19"/>
+              </w:rPr>
+              <w:t xml:space="preserve">, </w:t>
+            </w:r>
+            <w:proofErr w:type="spellStart"/>
+            <w:r>
+              <w:rPr>
+                <w:rStyle w:val="citation-134"/>
+                <w:rFonts w:ascii="Arial" w:hAnsi="Arial" w:cs="Arial"/>
+                <w:sz w:val="19"/>
+                <w:szCs w:val="19"/>
+              </w:rPr>
+              <w:t>nf</w:t>
+            </w:r>
+            <w:proofErr w:type="spellEnd"/>
+            <w:r>
+              <w:rPr>
+                <w:rStyle w:val="citation-134"/>
+                <w:rFonts w:ascii="Arial" w:hAnsi="Arial" w:cs="Arial"/>
+                <w:sz w:val="19"/>
+                <w:szCs w:val="19"/>
+              </w:rPr>
+              <w:t xml:space="preserve">, x no explican su contenido. </w:t>
             </w:r>
           </w:p>
         </w:tc>
@@ -3548,6 +3852,9 @@
         <w:pBdr>
           <w:bottom w:val="single" w:sz="4" w:space="0" w:color="1A6B3C"/>
         </w:pBdr>
+        <w:rPr>
+          <w:u w:val="single"/>
+        </w:rPr>
       </w:pPr>
       <w:r>
         <w:lastRenderedPageBreak/>
@@ -3852,7 +4159,15 @@
                 <w:sz w:val="19"/>
                 <w:szCs w:val="19"/>
               </w:rPr>
-              <w:t>Función muy extensa que viola el principio de responsabilidad única por clase. Incumplimiento del patrón 2 y patrón 9</w:t>
+              <w:t xml:space="preserve">Calcula subtotal, descuento, IVA, propina y actualiza estados. </w:t>
+            </w:r>
+            <w:r>
+              <w:rPr>
+                <w:rStyle w:val="citation-133"/>
+                <w:sz w:val="19"/>
+                <w:szCs w:val="19"/>
+              </w:rPr>
+              <w:t>Viola SRP.</w:t>
             </w:r>
           </w:p>
         </w:tc>
@@ -3968,17 +4283,61 @@
           </w:tcPr>
           <w:p>
             <w:pPr>
-              <w:rPr>
+              <w:pStyle w:val="NormalWeb"/>
+              <w:rPr>
+                <w:rFonts w:ascii="Arial" w:hAnsi="Arial" w:cs="Arial"/>
                 <w:sz w:val="19"/>
                 <w:szCs w:val="19"/>
               </w:rPr>
             </w:pPr>
             <w:r>
               <w:rPr>
-                <w:sz w:val="19"/>
-                <w:szCs w:val="19"/>
-              </w:rPr>
-              <w:t>Duplicación de variables. Muy mala practica</w:t>
+                <w:rStyle w:val="citation-132"/>
+                <w:rFonts w:ascii="Arial" w:hAnsi="Arial" w:cs="Arial"/>
+                <w:sz w:val="19"/>
+                <w:szCs w:val="19"/>
+              </w:rPr>
+              <w:t xml:space="preserve">La fórmula </w:t>
+            </w:r>
+            <w:proofErr w:type="spellStart"/>
+            <w:r>
+              <w:rPr>
+                <w:rStyle w:val="citation-132"/>
+                <w:rFonts w:ascii="Arial" w:hAnsi="Arial" w:cs="Arial"/>
+                <w:sz w:val="19"/>
+                <w:szCs w:val="19"/>
+              </w:rPr>
+              <w:t>iva</w:t>
+            </w:r>
+            <w:proofErr w:type="spellEnd"/>
+            <w:r>
+              <w:rPr>
+                <w:rStyle w:val="citation-132"/>
+                <w:rFonts w:ascii="Arial" w:hAnsi="Arial" w:cs="Arial"/>
+                <w:sz w:val="19"/>
+                <w:szCs w:val="19"/>
+              </w:rPr>
+              <w:t xml:space="preserve"> = </w:t>
+            </w:r>
+            <w:proofErr w:type="spellStart"/>
+            <w:r>
+              <w:rPr>
+                <w:rStyle w:val="citation-132"/>
+                <w:rFonts w:ascii="Arial" w:hAnsi="Arial" w:cs="Arial"/>
+                <w:sz w:val="19"/>
+                <w:szCs w:val="19"/>
+              </w:rPr>
+              <w:t>aux</w:t>
+            </w:r>
+            <w:proofErr w:type="spellEnd"/>
+            <w:r>
+              <w:rPr>
+                <w:rStyle w:val="citation-132"/>
+                <w:rFonts w:ascii="Arial" w:hAnsi="Arial" w:cs="Arial"/>
+                <w:sz w:val="19"/>
+                <w:szCs w:val="19"/>
+              </w:rPr>
+              <w:t xml:space="preserve"> * 0.19 se repite en cada bloque condicional. </w:t>
             </w:r>
           </w:p>
         </w:tc>
@@ -4112,11 +4471,22 @@
           </w:tcPr>
           <w:p>
             <w:pPr>
-              <w:rPr>
+              <w:pStyle w:val="NormalWeb"/>
+              <w:rPr>
+                <w:rFonts w:ascii="Arial" w:hAnsi="Arial" w:cs="Arial"/>
                 <w:sz w:val="19"/>
                 <w:szCs w:val="19"/>
               </w:rPr>
             </w:pPr>
+            <w:r>
+              <w:rPr>
+                <w:rStyle w:val="citation-131"/>
+                <w:rFonts w:ascii="Arial" w:hAnsi="Arial" w:cs="Arial"/>
+                <w:sz w:val="19"/>
+                <w:szCs w:val="19"/>
+              </w:rPr>
+              <w:t>Uso directo de 0.19, 0.10, 0.05, 50000 y 3 sin ser constantes.</w:t>
+            </w:r>
           </w:p>
         </w:tc>
       </w:tr>
@@ -4231,11 +4601,42 @@
           </w:tcPr>
           <w:p>
             <w:pPr>
-              <w:rPr>
+              <w:pStyle w:val="NormalWeb"/>
+              <w:rPr>
+                <w:rFonts w:ascii="Arial" w:hAnsi="Arial" w:cs="Arial"/>
                 <w:sz w:val="19"/>
                 <w:szCs w:val="19"/>
               </w:rPr>
             </w:pPr>
+            <w:r>
+              <w:rPr>
+                <w:rStyle w:val="citation-130"/>
+                <w:rFonts w:ascii="Arial" w:hAnsi="Arial" w:cs="Arial"/>
+                <w:sz w:val="19"/>
+                <w:szCs w:val="19"/>
+              </w:rPr>
+              <w:t xml:space="preserve">Estructuras </w:t>
+            </w:r>
+            <w:proofErr w:type="spellStart"/>
+            <w:r>
+              <w:rPr>
+                <w:rStyle w:val="citation-130"/>
+                <w:rFonts w:ascii="Arial" w:hAnsi="Arial" w:cs="Arial"/>
+                <w:sz w:val="19"/>
+                <w:szCs w:val="19"/>
+              </w:rPr>
+              <w:t>if-else</w:t>
+            </w:r>
+            <w:proofErr w:type="spellEnd"/>
+            <w:r>
+              <w:rPr>
+                <w:rStyle w:val="citation-130"/>
+                <w:rFonts w:ascii="Arial" w:hAnsi="Arial" w:cs="Arial"/>
+                <w:sz w:val="19"/>
+                <w:szCs w:val="19"/>
+              </w:rPr>
+              <w:t xml:space="preserve"> complejas que dificultan la lectura lógica.</w:t>
+            </w:r>
           </w:p>
         </w:tc>
       </w:tr>
@@ -4350,11 +4751,22 @@
           </w:tcPr>
           <w:p>
             <w:pPr>
-              <w:rPr>
+              <w:pStyle w:val="NormalWeb"/>
+              <w:rPr>
+                <w:rFonts w:ascii="Arial" w:hAnsi="Arial" w:cs="Arial"/>
                 <w:sz w:val="19"/>
                 <w:szCs w:val="19"/>
               </w:rPr>
             </w:pPr>
+            <w:r>
+              <w:rPr>
+                <w:rStyle w:val="citation-129"/>
+                <w:rFonts w:ascii="Arial" w:hAnsi="Arial" w:cs="Arial"/>
+                <w:sz w:val="19"/>
+                <w:szCs w:val="19"/>
+              </w:rPr>
+              <w:t>// sub = sub * 1.19; — código muerto que genera ruido visual.</w:t>
+            </w:r>
           </w:p>
         </w:tc>
       </w:tr>
@@ -4451,6 +4863,13 @@
                 <w:szCs w:val="19"/>
               </w:rPr>
             </w:pPr>
+            <w:r>
+              <w:rPr>
+                <w:sz w:val="19"/>
+                <w:szCs w:val="19"/>
+              </w:rPr>
+              <w:t>Línea 38 en adelante</w:t>
+            </w:r>
           </w:p>
         </w:tc>
         <w:tc>
@@ -4472,11 +4891,64 @@
           </w:tcPr>
           <w:p>
             <w:pPr>
-              <w:rPr>
+              <w:pStyle w:val="NormalWeb"/>
+              <w:rPr>
+                <w:rFonts w:ascii="Arial" w:hAnsi="Arial" w:cs="Arial"/>
                 <w:sz w:val="19"/>
                 <w:szCs w:val="19"/>
               </w:rPr>
             </w:pPr>
+            <w:proofErr w:type="gramStart"/>
+            <w:r>
+              <w:rPr>
+                <w:rStyle w:val="citation-128"/>
+                <w:rFonts w:ascii="Arial" w:hAnsi="Arial" w:cs="Arial"/>
+                <w:sz w:val="19"/>
+                <w:szCs w:val="19"/>
+              </w:rPr>
+              <w:t>procesar(</w:t>
+            </w:r>
+            <w:proofErr w:type="spellStart"/>
+            <w:proofErr w:type="gramEnd"/>
+            <w:r>
+              <w:rPr>
+                <w:rStyle w:val="citation-128"/>
+                <w:rFonts w:ascii="Arial" w:hAnsi="Arial" w:cs="Arial"/>
+                <w:sz w:val="19"/>
+                <w:szCs w:val="19"/>
+              </w:rPr>
+              <w:t>double</w:t>
+            </w:r>
+            <w:proofErr w:type="spellEnd"/>
+            <w:r>
+              <w:rPr>
+                <w:rStyle w:val="citation-128"/>
+                <w:rFonts w:ascii="Arial" w:hAnsi="Arial" w:cs="Arial"/>
+                <w:sz w:val="19"/>
+                <w:szCs w:val="19"/>
+              </w:rPr>
+              <w:t xml:space="preserve"> a, </w:t>
+            </w:r>
+            <w:proofErr w:type="spellStart"/>
+            <w:r>
+              <w:rPr>
+                <w:rStyle w:val="citation-128"/>
+                <w:rFonts w:ascii="Arial" w:hAnsi="Arial" w:cs="Arial"/>
+                <w:sz w:val="19"/>
+                <w:szCs w:val="19"/>
+              </w:rPr>
+              <w:t>double</w:t>
+            </w:r>
+            <w:proofErr w:type="spellEnd"/>
+            <w:r>
+              <w:rPr>
+                <w:rStyle w:val="citation-128"/>
+                <w:rFonts w:ascii="Arial" w:hAnsi="Arial" w:cs="Arial"/>
+                <w:sz w:val="19"/>
+                <w:szCs w:val="19"/>
+              </w:rPr>
+              <w:t xml:space="preserve"> b, ...) es ilegible y duplica lógica.</w:t>
+            </w:r>
           </w:p>
         </w:tc>
       </w:tr>
@@ -4581,6 +5053,13 @@
                 <w:szCs w:val="19"/>
               </w:rPr>
             </w:pPr>
+            <w:r>
+              <w:rPr>
+                <w:sz w:val="19"/>
+                <w:szCs w:val="19"/>
+              </w:rPr>
+              <w:t>Línea 15 aprox.</w:t>
+            </w:r>
           </w:p>
         </w:tc>
         <w:tc>
@@ -4602,11 +5081,22 @@
           </w:tcPr>
           <w:p>
             <w:pPr>
-              <w:rPr>
+              <w:pStyle w:val="NormalWeb"/>
+              <w:rPr>
+                <w:rFonts w:ascii="Arial" w:hAnsi="Arial" w:cs="Arial"/>
                 <w:sz w:val="19"/>
                 <w:szCs w:val="19"/>
               </w:rPr>
             </w:pPr>
+            <w:r>
+              <w:rPr>
+                <w:rStyle w:val="citation-127"/>
+                <w:rFonts w:ascii="Arial" w:hAnsi="Arial" w:cs="Arial"/>
+                <w:sz w:val="19"/>
+                <w:szCs w:val="19"/>
+              </w:rPr>
+              <w:t>Se usa para guardar valores que podrían calcularse directamente.</w:t>
+            </w:r>
           </w:p>
         </w:tc>
       </w:tr>
@@ -4693,6 +5183,13 @@
                 <w:szCs w:val="19"/>
               </w:rPr>
             </w:pPr>
+            <w:r>
+              <w:rPr>
+                <w:sz w:val="19"/>
+                <w:szCs w:val="19"/>
+              </w:rPr>
+              <w:t>Líneas 7, 20, 30</w:t>
+            </w:r>
           </w:p>
         </w:tc>
         <w:tc>
@@ -4714,11 +5211,22 @@
           </w:tcPr>
           <w:p>
             <w:pPr>
-              <w:rPr>
+              <w:pStyle w:val="NormalWeb"/>
+              <w:rPr>
+                <w:rFonts w:ascii="Arial" w:hAnsi="Arial" w:cs="Arial"/>
                 <w:sz w:val="19"/>
                 <w:szCs w:val="19"/>
               </w:rPr>
             </w:pPr>
+            <w:r>
+              <w:rPr>
+                <w:rStyle w:val="citation-126"/>
+                <w:rFonts w:ascii="Arial" w:hAnsi="Arial" w:cs="Arial"/>
+                <w:sz w:val="19"/>
+                <w:szCs w:val="19"/>
+              </w:rPr>
+              <w:t>// multiplica precio por cantidad justo encima de la operación.</w:t>
+            </w:r>
           </w:p>
         </w:tc>
       </w:tr>
@@ -4805,6 +5313,13 @@
                 <w:szCs w:val="19"/>
               </w:rPr>
             </w:pPr>
+            <w:r>
+              <w:rPr>
+                <w:sz w:val="19"/>
+                <w:szCs w:val="19"/>
+              </w:rPr>
+              <w:t>Al final de métodos</w:t>
+            </w:r>
           </w:p>
         </w:tc>
         <w:tc>
@@ -4831,6 +5346,68 @@
                 <w:szCs w:val="19"/>
               </w:rPr>
             </w:pPr>
+            <w:r>
+              <w:rPr>
+                <w:rStyle w:val="citation-125"/>
+                <w:sz w:val="19"/>
+                <w:szCs w:val="19"/>
+              </w:rPr>
+              <w:t xml:space="preserve">// fin </w:t>
+            </w:r>
+            <w:proofErr w:type="spellStart"/>
+            <w:r>
+              <w:rPr>
+                <w:rStyle w:val="citation-125"/>
+                <w:sz w:val="19"/>
+                <w:szCs w:val="19"/>
+              </w:rPr>
+              <w:t>while</w:t>
+            </w:r>
+            <w:proofErr w:type="spellEnd"/>
+            <w:r>
+              <w:rPr>
+                <w:rStyle w:val="citation-125"/>
+                <w:sz w:val="19"/>
+                <w:szCs w:val="19"/>
+              </w:rPr>
+              <w:t xml:space="preserve">, // fin </w:t>
+            </w:r>
+            <w:proofErr w:type="spellStart"/>
+            <w:r>
+              <w:rPr>
+                <w:rStyle w:val="citation-125"/>
+                <w:sz w:val="19"/>
+                <w:szCs w:val="19"/>
+              </w:rPr>
+              <w:t>if</w:t>
+            </w:r>
+            <w:proofErr w:type="spellEnd"/>
+            <w:r>
+              <w:rPr>
+                <w:rStyle w:val="citation-125"/>
+                <w:sz w:val="19"/>
+                <w:szCs w:val="19"/>
+              </w:rPr>
+              <w:t xml:space="preserve">; sobran si hay buena </w:t>
+            </w:r>
+            <w:proofErr w:type="spellStart"/>
+            <w:r>
+              <w:rPr>
+                <w:rStyle w:val="citation-125"/>
+                <w:sz w:val="19"/>
+                <w:szCs w:val="19"/>
+              </w:rPr>
+              <w:t>indentación</w:t>
+            </w:r>
+            <w:proofErr w:type="spellEnd"/>
+            <w:r>
+              <w:rPr>
+                <w:rStyle w:val="citation-125"/>
+                <w:sz w:val="19"/>
+                <w:szCs w:val="19"/>
+              </w:rPr>
+              <w:t>.</w:t>
+            </w:r>
           </w:p>
         </w:tc>
       </w:tr>
@@ -5089,7 +5666,21 @@
               <w:right w:w="100" w:type="dxa"/>
             </w:tcMar>
           </w:tcPr>
-          <w:p/>
+          <w:p>
+            <w:pPr>
+              <w:rPr>
+                <w:sz w:val="19"/>
+                <w:szCs w:val="19"/>
+              </w:rPr>
+            </w:pPr>
+            <w:r>
+              <w:rPr>
+                <w:sz w:val="19"/>
+                <w:szCs w:val="19"/>
+              </w:rPr>
+              <w:t>Línea 3</w:t>
+            </w:r>
+          </w:p>
         </w:tc>
         <w:tc>
           <w:tcPr>
@@ -5108,7 +5699,69 @@
               <w:right w:w="100" w:type="dxa"/>
             </w:tcMar>
           </w:tcPr>
-          <w:p/>
+          <w:p>
+            <w:pPr>
+              <w:rPr>
+                <w:sz w:val="19"/>
+                <w:szCs w:val="19"/>
+              </w:rPr>
+            </w:pPr>
+            <w:r>
+              <w:rPr>
+                <w:sz w:val="19"/>
+                <w:szCs w:val="19"/>
+              </w:rPr>
+              <w:t>Recibe 7 dobles/enteros con nombres abreviados (</w:t>
+            </w:r>
+            <w:proofErr w:type="spellStart"/>
+            <w:r>
+              <w:rPr>
+                <w:sz w:val="19"/>
+                <w:szCs w:val="19"/>
+              </w:rPr>
+              <w:t>pr</w:t>
+            </w:r>
+            <w:proofErr w:type="spellEnd"/>
+            <w:r>
+              <w:rPr>
+                <w:sz w:val="19"/>
+                <w:szCs w:val="19"/>
+              </w:rPr>
+              <w:t xml:space="preserve">, </w:t>
+            </w:r>
+            <w:proofErr w:type="spellStart"/>
+            <w:r>
+              <w:rPr>
+                <w:sz w:val="19"/>
+                <w:szCs w:val="19"/>
+              </w:rPr>
+              <w:t>cn</w:t>
+            </w:r>
+            <w:proofErr w:type="spellEnd"/>
+            <w:r>
+              <w:rPr>
+                <w:sz w:val="19"/>
+                <w:szCs w:val="19"/>
+              </w:rPr>
+              <w:t xml:space="preserve">, </w:t>
+            </w:r>
+            <w:proofErr w:type="spellStart"/>
+            <w:r>
+              <w:rPr>
+                <w:sz w:val="19"/>
+                <w:szCs w:val="19"/>
+              </w:rPr>
+              <w:t>dc</w:t>
+            </w:r>
+            <w:proofErr w:type="spellEnd"/>
+            <w:r>
+              <w:rPr>
+                <w:sz w:val="19"/>
+                <w:szCs w:val="19"/>
+              </w:rPr>
+              <w:t>).</w:t>
+            </w:r>
+          </w:p>
         </w:tc>
       </w:tr>
       <w:tr>
@@ -5197,7 +5850,21 @@
               <w:right w:w="100" w:type="dxa"/>
             </w:tcMar>
           </w:tcPr>
-          <w:p/>
+          <w:p>
+            <w:pPr>
+              <w:rPr>
+                <w:sz w:val="19"/>
+                <w:szCs w:val="19"/>
+              </w:rPr>
+            </w:pPr>
+            <w:r>
+              <w:rPr>
+                <w:sz w:val="19"/>
+                <w:szCs w:val="19"/>
+              </w:rPr>
+              <w:t>Líneas 19-20</w:t>
+            </w:r>
+          </w:p>
         </w:tc>
         <w:tc>
           <w:tcPr>
@@ -5216,7 +5883,58 @@
               <w:right w:w="100" w:type="dxa"/>
             </w:tcMar>
           </w:tcPr>
-          <w:p/>
+          <w:p>
+            <w:pPr>
+              <w:rPr>
+                <w:sz w:val="19"/>
+                <w:szCs w:val="19"/>
+              </w:rPr>
+            </w:pPr>
+            <w:r>
+              <w:rPr>
+                <w:rStyle w:val="citation-123"/>
+                <w:sz w:val="19"/>
+                <w:szCs w:val="19"/>
+              </w:rPr>
+              <w:t xml:space="preserve">Dice validar, pero modifica </w:t>
+            </w:r>
+            <w:proofErr w:type="spellStart"/>
+            <w:r>
+              <w:rPr>
+                <w:rStyle w:val="citation-123"/>
+                <w:sz w:val="19"/>
+                <w:szCs w:val="19"/>
+              </w:rPr>
+              <w:t>Datos.tot</w:t>
+            </w:r>
+            <w:proofErr w:type="spellEnd"/>
+            <w:r>
+              <w:rPr>
+                <w:rStyle w:val="citation-123"/>
+                <w:sz w:val="19"/>
+                <w:szCs w:val="19"/>
+              </w:rPr>
+              <w:t xml:space="preserve"> y </w:t>
+            </w:r>
+            <w:proofErr w:type="spellStart"/>
+            <w:r>
+              <w:rPr>
+                <w:rStyle w:val="citation-123"/>
+                <w:sz w:val="19"/>
+                <w:szCs w:val="19"/>
+              </w:rPr>
+              <w:t>Datos.tmp</w:t>
+            </w:r>
+            <w:proofErr w:type="spellEnd"/>
+            <w:r>
+              <w:rPr>
+                <w:rStyle w:val="citation-123"/>
+                <w:sz w:val="19"/>
+                <w:szCs w:val="19"/>
+              </w:rPr>
+              <w:t>.</w:t>
+            </w:r>
+          </w:p>
         </w:tc>
       </w:tr>
       <w:tr>
@@ -5313,7 +6031,21 @@
               <w:right w:w="100" w:type="dxa"/>
             </w:tcMar>
           </w:tcPr>
-          <w:p/>
+          <w:p>
+            <w:pPr>
+              <w:rPr>
+                <w:sz w:val="19"/>
+                <w:szCs w:val="19"/>
+              </w:rPr>
+            </w:pPr>
+            <w:r>
+              <w:rPr>
+                <w:sz w:val="19"/>
+                <w:szCs w:val="19"/>
+              </w:rPr>
+              <w:t>Línea 11</w:t>
+            </w:r>
+          </w:p>
         </w:tc>
         <w:tc>
           <w:tcPr>
@@ -5332,7 +6064,42 @@
               <w:right w:w="100" w:type="dxa"/>
             </w:tcMar>
           </w:tcPr>
-          <w:p/>
+          <w:p>
+            <w:pPr>
+              <w:rPr>
+                <w:sz w:val="19"/>
+                <w:szCs w:val="19"/>
+              </w:rPr>
+            </w:pPr>
+            <w:proofErr w:type="spellStart"/>
+            <w:proofErr w:type="gramStart"/>
+            <w:r>
+              <w:rPr>
+                <w:rStyle w:val="citation-122"/>
+                <w:sz w:val="19"/>
+                <w:szCs w:val="19"/>
+              </w:rPr>
+              <w:t>println</w:t>
+            </w:r>
+            <w:proofErr w:type="spellEnd"/>
+            <w:r>
+              <w:rPr>
+                <w:rStyle w:val="citation-122"/>
+                <w:sz w:val="19"/>
+                <w:szCs w:val="19"/>
+              </w:rPr>
+              <w:t>(</w:t>
+            </w:r>
+            <w:proofErr w:type="gramEnd"/>
+            <w:r>
+              <w:rPr>
+                <w:rStyle w:val="citation-122"/>
+                <w:sz w:val="19"/>
+                <w:szCs w:val="19"/>
+              </w:rPr>
+              <w:t>"RESTAURANTE EL BUEN SABOR") dentro de un cálculo.</w:t>
+            </w:r>
+          </w:p>
         </w:tc>
       </w:tr>
       <w:tr>
@@ -5411,7 +6178,21 @@
               <w:right w:w="100" w:type="dxa"/>
             </w:tcMar>
           </w:tcPr>
-          <w:p/>
+          <w:p>
+            <w:pPr>
+              <w:rPr>
+                <w:sz w:val="19"/>
+                <w:szCs w:val="19"/>
+              </w:rPr>
+            </w:pPr>
+            <w:r>
+              <w:rPr>
+                <w:sz w:val="19"/>
+                <w:szCs w:val="19"/>
+              </w:rPr>
+              <w:t>Líneas 23-38</w:t>
+            </w:r>
+          </w:p>
         </w:tc>
         <w:tc>
           <w:tcPr>
@@ -5430,7 +6211,45 @@
               <w:right w:w="100" w:type="dxa"/>
             </w:tcMar>
           </w:tcPr>
-          <w:p/>
+          <w:p>
+            <w:pPr>
+              <w:pStyle w:val="NormalWeb"/>
+              <w:rPr>
+                <w:rFonts w:ascii="Arial" w:hAnsi="Arial" w:cs="Arial"/>
+                <w:sz w:val="19"/>
+                <w:szCs w:val="19"/>
+              </w:rPr>
+            </w:pPr>
+            <w:r>
+              <w:rPr>
+                <w:rStyle w:val="citation-121"/>
+                <w:rFonts w:ascii="Arial" w:hAnsi="Arial" w:cs="Arial"/>
+                <w:sz w:val="19"/>
+                <w:szCs w:val="19"/>
+              </w:rPr>
+              <w:t xml:space="preserve">Gran bloque de lógica antigua abandonada dentro de </w:t>
+            </w:r>
+            <w:proofErr w:type="gramStart"/>
+            <w:r>
+              <w:rPr>
+                <w:rStyle w:val="citation-121"/>
+                <w:rFonts w:ascii="Arial" w:hAnsi="Arial" w:cs="Arial"/>
+                <w:sz w:val="19"/>
+                <w:szCs w:val="19"/>
+              </w:rPr>
+              <w:t>reiniciar(</w:t>
+            </w:r>
+            <w:proofErr w:type="gramEnd"/>
+            <w:r>
+              <w:rPr>
+                <w:rStyle w:val="citation-121"/>
+                <w:rFonts w:ascii="Arial" w:hAnsi="Arial" w:cs="Arial"/>
+                <w:sz w:val="19"/>
+                <w:szCs w:val="19"/>
+              </w:rPr>
+              <w:t>)</w:t>
+            </w:r>
+          </w:p>
         </w:tc>
       </w:tr>
       <w:tr>
@@ -5527,7 +6346,21 @@
               <w:right w:w="100" w:type="dxa"/>
             </w:tcMar>
           </w:tcPr>
-          <w:p/>
+          <w:p>
+            <w:pPr>
+              <w:rPr>
+                <w:sz w:val="19"/>
+                <w:szCs w:val="19"/>
+              </w:rPr>
+            </w:pPr>
+            <w:r>
+              <w:rPr>
+                <w:sz w:val="19"/>
+                <w:szCs w:val="19"/>
+              </w:rPr>
+              <w:t>Líneas 4-12</w:t>
+            </w:r>
+          </w:p>
         </w:tc>
         <w:tc>
           <w:tcPr>
@@ -5546,7 +6379,25 @@
               <w:right w:w="100" w:type="dxa"/>
             </w:tcMar>
           </w:tcPr>
-          <w:p/>
+          <w:p>
+            <w:pPr>
+              <w:pStyle w:val="NormalWeb"/>
+              <w:rPr>
+                <w:rFonts w:ascii="Arial" w:hAnsi="Arial" w:cs="Arial"/>
+                <w:sz w:val="19"/>
+                <w:szCs w:val="19"/>
+              </w:rPr>
+            </w:pPr>
+            <w:r>
+              <w:rPr>
+                <w:rStyle w:val="citation-120"/>
+                <w:rFonts w:ascii="Arial" w:hAnsi="Arial" w:cs="Arial"/>
+                <w:sz w:val="19"/>
+                <w:szCs w:val="19"/>
+              </w:rPr>
+              <w:t>Copias innecesarias de valores antes de retornarlos.</w:t>
+            </w:r>
+          </w:p>
         </w:tc>
       </w:tr>
     </w:tbl>
@@ -5814,7 +6665,21 @@
               <w:right w:w="100" w:type="dxa"/>
             </w:tcMar>
           </w:tcPr>
-          <w:p/>
+          <w:p>
+            <w:pPr>
+              <w:rPr>
+                <w:sz w:val="19"/>
+                <w:szCs w:val="19"/>
+              </w:rPr>
+            </w:pPr>
+            <w:r>
+              <w:rPr>
+                <w:sz w:val="19"/>
+                <w:szCs w:val="19"/>
+              </w:rPr>
+              <w:t>Líneas 25-69</w:t>
+            </w:r>
+          </w:p>
         </w:tc>
         <w:tc>
           <w:tcPr>
@@ -5833,7 +6698,21 @@
               <w:right w:w="100" w:type="dxa"/>
             </w:tcMar>
           </w:tcPr>
-          <w:p/>
+          <w:p>
+            <w:pPr>
+              <w:rPr>
+                <w:sz w:val="19"/>
+                <w:szCs w:val="19"/>
+              </w:rPr>
+            </w:pPr>
+            <w:r>
+              <w:rPr>
+                <w:sz w:val="19"/>
+                <w:szCs w:val="19"/>
+              </w:rPr>
+              <w:t>Calcula, imprime y cambia el estado de la mesa.</w:t>
+            </w:r>
+          </w:p>
         </w:tc>
       </w:tr>
       <w:tr>
@@ -5912,7 +6791,22 @@
               <w:right w:w="100" w:type="dxa"/>
             </w:tcMar>
           </w:tcPr>
-          <w:p/>
+          <w:p>
+            <w:pPr>
+              <w:jc w:val="center"/>
+              <w:rPr>
+                <w:sz w:val="19"/>
+                <w:szCs w:val="19"/>
+              </w:rPr>
+            </w:pPr>
+            <w:r>
+              <w:rPr>
+                <w:sz w:val="19"/>
+                <w:szCs w:val="19"/>
+              </w:rPr>
+              <w:t>Líneas 26 y 71</w:t>
+            </w:r>
+          </w:p>
         </w:tc>
         <w:tc>
           <w:tcPr>
@@ -5931,7 +6825,25 @@
               <w:right w:w="100" w:type="dxa"/>
             </w:tcMar>
           </w:tcPr>
-          <w:p/>
+          <w:p>
+            <w:pPr>
+              <w:pStyle w:val="NormalWeb"/>
+              <w:rPr>
+                <w:rFonts w:ascii="Arial" w:hAnsi="Arial" w:cs="Arial"/>
+                <w:sz w:val="19"/>
+                <w:szCs w:val="19"/>
+              </w:rPr>
+            </w:pPr>
+            <w:r>
+              <w:rPr>
+                <w:rStyle w:val="citation-118"/>
+                <w:rFonts w:ascii="Arial" w:hAnsi="Arial" w:cs="Arial"/>
+                <w:sz w:val="19"/>
+                <w:szCs w:val="19"/>
+              </w:rPr>
+              <w:t xml:space="preserve">La lógica de factura de Proceso.java se repite aquí dos veces. </w:t>
+            </w:r>
+          </w:p>
         </w:tc>
       </w:tr>
       <w:tr>
@@ -6010,7 +6922,21 @@
               <w:right w:w="100" w:type="dxa"/>
             </w:tcMar>
           </w:tcPr>
-          <w:p/>
+          <w:p>
+            <w:pPr>
+              <w:rPr>
+                <w:sz w:val="19"/>
+                <w:szCs w:val="19"/>
+              </w:rPr>
+            </w:pPr>
+            <w:r>
+              <w:rPr>
+                <w:sz w:val="19"/>
+                <w:szCs w:val="19"/>
+              </w:rPr>
+              <w:t>Entre métodos</w:t>
+            </w:r>
+          </w:p>
         </w:tc>
         <w:tc>
           <w:tcPr>
@@ -6029,7 +6955,36 @@
               <w:right w:w="100" w:type="dxa"/>
             </w:tcMar>
           </w:tcPr>
-          <w:p/>
+          <w:p>
+            <w:pPr>
+              <w:pStyle w:val="NormalWeb"/>
+              <w:rPr>
+                <w:rFonts w:ascii="Arial" w:hAnsi="Arial" w:cs="Arial"/>
+                <w:sz w:val="19"/>
+                <w:szCs w:val="19"/>
+              </w:rPr>
+            </w:pPr>
+            <w:proofErr w:type="spellStart"/>
+            <w:r>
+              <w:rPr>
+                <w:rStyle w:val="citation-117"/>
+                <w:rFonts w:ascii="Arial" w:hAnsi="Arial" w:cs="Arial"/>
+                <w:sz w:val="19"/>
+                <w:szCs w:val="19"/>
+              </w:rPr>
+              <w:t>imprimirFacturaCompleta</w:t>
+            </w:r>
+            <w:proofErr w:type="spellEnd"/>
+            <w:r>
+              <w:rPr>
+                <w:rStyle w:val="citation-117"/>
+                <w:rFonts w:ascii="Arial" w:hAnsi="Arial" w:cs="Arial"/>
+                <w:sz w:val="19"/>
+                <w:szCs w:val="19"/>
+              </w:rPr>
+              <w:t xml:space="preserve"> y Resumen son casi iguales.</w:t>
+            </w:r>
+          </w:p>
         </w:tc>
       </w:tr>
       <w:tr>
@@ -6127,7 +7082,21 @@
               <w:right w:w="100" w:type="dxa"/>
             </w:tcMar>
           </w:tcPr>
-          <w:p/>
+          <w:p>
+            <w:pPr>
+              <w:rPr>
+                <w:sz w:val="19"/>
+                <w:szCs w:val="19"/>
+              </w:rPr>
+            </w:pPr>
+            <w:r>
+              <w:rPr>
+                <w:sz w:val="19"/>
+                <w:szCs w:val="19"/>
+              </w:rPr>
+              <w:t>Líneas 44, 88</w:t>
+            </w:r>
+          </w:p>
         </w:tc>
         <w:tc>
           <w:tcPr>
@@ -6146,7 +7115,25 @@
               <w:right w:w="100" w:type="dxa"/>
             </w:tcMar>
           </w:tcPr>
-          <w:p/>
+          <w:p>
+            <w:pPr>
+              <w:pStyle w:val="NormalWeb"/>
+              <w:rPr>
+                <w:rFonts w:ascii="Arial" w:hAnsi="Arial" w:cs="Arial"/>
+                <w:sz w:val="19"/>
+                <w:szCs w:val="19"/>
+              </w:rPr>
+            </w:pPr>
+            <w:r>
+              <w:rPr>
+                <w:rStyle w:val="citation-116"/>
+                <w:rFonts w:ascii="Arial" w:hAnsi="Arial" w:cs="Arial"/>
+                <w:sz w:val="19"/>
+                <w:szCs w:val="19"/>
+              </w:rPr>
+              <w:t xml:space="preserve">Datos de NIT y dirección escritos literalmente otra vez. </w:t>
+            </w:r>
+          </w:p>
         </w:tc>
       </w:tr>
       <w:tr>
@@ -6243,7 +7230,21 @@
               <w:right w:w="100" w:type="dxa"/>
             </w:tcMar>
           </w:tcPr>
-          <w:p/>
+          <w:p>
+            <w:pPr>
+              <w:rPr>
+                <w:sz w:val="19"/>
+                <w:szCs w:val="19"/>
+              </w:rPr>
+            </w:pPr>
+            <w:r>
+              <w:rPr>
+                <w:sz w:val="19"/>
+                <w:szCs w:val="19"/>
+              </w:rPr>
+              <w:t>Líneas 53, 95</w:t>
+            </w:r>
+          </w:p>
         </w:tc>
         <w:tc>
           <w:tcPr>
@@ -6262,7 +7263,45 @@
               <w:right w:w="100" w:type="dxa"/>
             </w:tcMar>
           </w:tcPr>
-          <w:p/>
+          <w:p>
+            <w:pPr>
+              <w:pStyle w:val="NormalWeb"/>
+              <w:rPr>
+                <w:rFonts w:ascii="Arial" w:hAnsi="Arial" w:cs="Arial"/>
+                <w:sz w:val="19"/>
+                <w:szCs w:val="19"/>
+              </w:rPr>
+            </w:pPr>
+            <w:r>
+              <w:rPr>
+                <w:rStyle w:val="citation-115"/>
+                <w:rFonts w:ascii="Arial" w:hAnsi="Arial" w:cs="Arial"/>
+                <w:sz w:val="19"/>
+                <w:szCs w:val="19"/>
+              </w:rPr>
+              <w:t>La cadena de formato %-20s x%-6</w:t>
+            </w:r>
+            <w:proofErr w:type="gramStart"/>
+            <w:r>
+              <w:rPr>
+                <w:rStyle w:val="citation-115"/>
+                <w:rFonts w:ascii="Arial" w:hAnsi="Arial" w:cs="Arial"/>
+                <w:sz w:val="19"/>
+                <w:szCs w:val="19"/>
+              </w:rPr>
+              <w:t>d...</w:t>
+            </w:r>
+            <w:proofErr w:type="gramEnd"/>
+            <w:r>
+              <w:rPr>
+                <w:rStyle w:val="citation-115"/>
+                <w:rFonts w:ascii="Arial" w:hAnsi="Arial" w:cs="Arial"/>
+                <w:sz w:val="19"/>
+                <w:szCs w:val="19"/>
+              </w:rPr>
+              <w:t xml:space="preserve"> debería ser una constante.</w:t>
+            </w:r>
+          </w:p>
         </w:tc>
       </w:tr>
     </w:tbl>
@@ -6510,7 +7549,39 @@
               <w:right w:w="100" w:type="dxa"/>
             </w:tcMar>
           </w:tcPr>
-          <w:p/>
+          <w:p>
+            <w:pPr>
+              <w:rPr>
+                <w:sz w:val="19"/>
+                <w:szCs w:val="19"/>
+              </w:rPr>
+            </w:pPr>
+            <w:proofErr w:type="spellStart"/>
+            <w:proofErr w:type="gramStart"/>
+            <w:r>
+              <w:rPr>
+                <w:sz w:val="19"/>
+                <w:szCs w:val="19"/>
+              </w:rPr>
+              <w:t>main</w:t>
+            </w:r>
+            <w:proofErr w:type="spellEnd"/>
+            <w:r>
+              <w:rPr>
+                <w:sz w:val="19"/>
+                <w:szCs w:val="19"/>
+              </w:rPr>
+              <w:t>(</w:t>
+            </w:r>
+            <w:proofErr w:type="gramEnd"/>
+            <w:r>
+              <w:rPr>
+                <w:sz w:val="19"/>
+                <w:szCs w:val="19"/>
+              </w:rPr>
+              <w:t>)</w:t>
+            </w:r>
+          </w:p>
         </w:tc>
         <w:tc>
           <w:tcPr>
@@ -6529,7 +7600,25 @@
               <w:right w:w="100" w:type="dxa"/>
             </w:tcMar>
           </w:tcPr>
-          <w:p/>
+          <w:p>
+            <w:pPr>
+              <w:pStyle w:val="NormalWeb"/>
+              <w:rPr>
+                <w:rFonts w:ascii="Arial" w:hAnsi="Arial" w:cs="Arial"/>
+                <w:sz w:val="19"/>
+                <w:szCs w:val="19"/>
+              </w:rPr>
+            </w:pPr>
+            <w:r>
+              <w:rPr>
+                <w:rStyle w:val="citation-114"/>
+                <w:rFonts w:ascii="Arial" w:hAnsi="Arial" w:cs="Arial"/>
+                <w:sz w:val="19"/>
+                <w:szCs w:val="19"/>
+              </w:rPr>
+              <w:t>Gestiona el menú, las entradas y la lógica al mismo tiempo.</w:t>
+            </w:r>
+          </w:p>
         </w:tc>
       </w:tr>
       <w:tr>
@@ -6608,7 +7697,39 @@
               <w:right w:w="100" w:type="dxa"/>
             </w:tcMar>
           </w:tcPr>
-          <w:p/>
+          <w:p>
+            <w:pPr>
+              <w:rPr>
+                <w:sz w:val="19"/>
+                <w:szCs w:val="19"/>
+              </w:rPr>
+            </w:pPr>
+            <w:proofErr w:type="spellStart"/>
+            <w:proofErr w:type="gramStart"/>
+            <w:r>
+              <w:rPr>
+                <w:sz w:val="19"/>
+                <w:szCs w:val="19"/>
+              </w:rPr>
+              <w:t>main</w:t>
+            </w:r>
+            <w:proofErr w:type="spellEnd"/>
+            <w:r>
+              <w:rPr>
+                <w:sz w:val="19"/>
+                <w:szCs w:val="19"/>
+              </w:rPr>
+              <w:t>(</w:t>
+            </w:r>
+            <w:proofErr w:type="gramEnd"/>
+            <w:r>
+              <w:rPr>
+                <w:sz w:val="19"/>
+                <w:szCs w:val="19"/>
+              </w:rPr>
+              <w:t>)</w:t>
+            </w:r>
+          </w:p>
         </w:tc>
         <w:tc>
           <w:tcPr>
@@ -6627,7 +7748,36 @@
               <w:right w:w="100" w:type="dxa"/>
             </w:tcMar>
           </w:tcPr>
-          <w:p/>
+          <w:p>
+            <w:pPr>
+              <w:pStyle w:val="NormalWeb"/>
+              <w:rPr>
+                <w:rFonts w:ascii="Arial" w:hAnsi="Arial" w:cs="Arial"/>
+                <w:sz w:val="19"/>
+                <w:szCs w:val="19"/>
+              </w:rPr>
+            </w:pPr>
+            <w:proofErr w:type="spellStart"/>
+            <w:r>
+              <w:rPr>
+                <w:rStyle w:val="citation-113"/>
+                <w:rFonts w:ascii="Arial" w:hAnsi="Arial" w:cs="Arial"/>
+                <w:sz w:val="19"/>
+                <w:szCs w:val="19"/>
+              </w:rPr>
+              <w:t>sc</w:t>
+            </w:r>
+            <w:proofErr w:type="spellEnd"/>
+            <w:r>
+              <w:rPr>
+                <w:rStyle w:val="citation-113"/>
+                <w:rFonts w:ascii="Arial" w:hAnsi="Arial" w:cs="Arial"/>
+                <w:sz w:val="19"/>
+                <w:szCs w:val="19"/>
+              </w:rPr>
+              <w:t xml:space="preserve"> y sc2 se usan para leer el mismo flujo, causando conflictos.</w:t>
+            </w:r>
+          </w:p>
         </w:tc>
       </w:tr>
       <w:tr>
@@ -6706,7 +7856,21 @@
               <w:right w:w="100" w:type="dxa"/>
             </w:tcMar>
           </w:tcPr>
-          <w:p/>
+          <w:p>
+            <w:pPr>
+              <w:rPr>
+                <w:sz w:val="19"/>
+                <w:szCs w:val="19"/>
+              </w:rPr>
+            </w:pPr>
+            <w:r>
+              <w:rPr>
+                <w:sz w:val="19"/>
+                <w:szCs w:val="19"/>
+              </w:rPr>
+              <w:t>continuar</w:t>
+            </w:r>
+          </w:p>
         </w:tc>
         <w:tc>
           <w:tcPr>
@@ -6725,7 +7889,56 @@
               <w:right w:w="100" w:type="dxa"/>
             </w:tcMar>
           </w:tcPr>
-          <w:p/>
+          <w:p>
+            <w:pPr>
+              <w:pStyle w:val="NormalWeb"/>
+              <w:rPr>
+                <w:rFonts w:ascii="Arial" w:hAnsi="Arial" w:cs="Arial"/>
+                <w:sz w:val="19"/>
+                <w:szCs w:val="19"/>
+              </w:rPr>
+            </w:pPr>
+            <w:proofErr w:type="spellStart"/>
+            <w:r>
+              <w:rPr>
+                <w:rStyle w:val="citation-112"/>
+                <w:rFonts w:ascii="Arial" w:hAnsi="Arial" w:cs="Arial"/>
+                <w:sz w:val="19"/>
+                <w:szCs w:val="19"/>
+              </w:rPr>
+              <w:t>boolean</w:t>
+            </w:r>
+            <w:proofErr w:type="spellEnd"/>
+            <w:r>
+              <w:rPr>
+                <w:rStyle w:val="citation-112"/>
+                <w:rFonts w:ascii="Arial" w:hAnsi="Arial" w:cs="Arial"/>
+                <w:sz w:val="19"/>
+                <w:szCs w:val="19"/>
+              </w:rPr>
+              <w:t xml:space="preserve"> continuar se </w:t>
+            </w:r>
+            <w:proofErr w:type="gramStart"/>
+            <w:r>
+              <w:rPr>
+                <w:rStyle w:val="citation-112"/>
+                <w:rFonts w:ascii="Arial" w:hAnsi="Arial" w:cs="Arial"/>
+                <w:sz w:val="19"/>
+                <w:szCs w:val="19"/>
+              </w:rPr>
+              <w:t>declara</w:t>
+            </w:r>
+            <w:proofErr w:type="gramEnd"/>
+            <w:r>
+              <w:rPr>
+                <w:rStyle w:val="citation-112"/>
+                <w:rFonts w:ascii="Arial" w:hAnsi="Arial" w:cs="Arial"/>
+                <w:sz w:val="19"/>
+                <w:szCs w:val="19"/>
+              </w:rPr>
+              <w:t xml:space="preserve"> pero nunca afecta el flujo.</w:t>
+            </w:r>
+          </w:p>
         </w:tc>
       </w:tr>
       <w:tr>
@@ -6804,7 +8017,30 @@
               <w:right w:w="100" w:type="dxa"/>
             </w:tcMar>
           </w:tcPr>
-          <w:p/>
+          <w:p>
+            <w:pPr>
+              <w:rPr>
+                <w:sz w:val="19"/>
+                <w:szCs w:val="19"/>
+              </w:rPr>
+            </w:pPr>
+            <w:r>
+              <w:rPr>
+                <w:sz w:val="19"/>
+                <w:szCs w:val="19"/>
+              </w:rPr>
+              <w:t xml:space="preserve">Bloques </w:t>
+            </w:r>
+            <w:r>
+              <w:rPr>
+                <w:rStyle w:val="CdigoHTML"/>
+                <w:rFonts w:ascii="Arial" w:eastAsia="Arial" w:hAnsi="Arial" w:cs="Arial"/>
+                <w:sz w:val="19"/>
+                <w:szCs w:val="19"/>
+              </w:rPr>
+              <w:t>case</w:t>
+            </w:r>
+          </w:p>
         </w:tc>
         <w:tc>
           <w:tcPr>
@@ -6823,7 +8059,21 @@
               <w:right w:w="100" w:type="dxa"/>
             </w:tcMar>
           </w:tcPr>
-          <w:p/>
+          <w:p>
+            <w:pPr>
+              <w:rPr>
+                <w:sz w:val="19"/>
+                <w:szCs w:val="19"/>
+              </w:rPr>
+            </w:pPr>
+            <w:r>
+              <w:rPr>
+                <w:sz w:val="19"/>
+                <w:szCs w:val="19"/>
+              </w:rPr>
+              <w:t>Validaciones y cálculos mezclados con la interfaz de usuario</w:t>
+            </w:r>
+          </w:p>
         </w:tc>
       </w:tr>
       <w:tr>
@@ -6920,7 +8170,23 @@
               <w:right w:w="100" w:type="dxa"/>
             </w:tcMar>
           </w:tcPr>
-          <w:p/>
+          <w:p>
+            <w:pPr>
+              <w:rPr>
+                <w:sz w:val="19"/>
+                <w:szCs w:val="19"/>
+              </w:rPr>
+            </w:pPr>
+            <w:proofErr w:type="spellStart"/>
+            <w:r>
+              <w:rPr>
+                <w:sz w:val="19"/>
+                <w:szCs w:val="19"/>
+              </w:rPr>
+              <w:t>System.out.println</w:t>
+            </w:r>
+            <w:proofErr w:type="spellEnd"/>
+          </w:p>
         </w:tc>
         <w:tc>
           <w:tcPr>
@@ -6939,7 +8205,25 @@
               <w:right w:w="100" w:type="dxa"/>
             </w:tcMar>
           </w:tcPr>
-          <w:p/>
+          <w:p>
+            <w:pPr>
+              <w:pStyle w:val="NormalWeb"/>
+              <w:rPr>
+                <w:rFonts w:ascii="Arial" w:hAnsi="Arial" w:cs="Arial"/>
+                <w:sz w:val="19"/>
+                <w:szCs w:val="19"/>
+              </w:rPr>
+            </w:pPr>
+            <w:r>
+              <w:rPr>
+                <w:rStyle w:val="citation-110"/>
+                <w:rFonts w:ascii="Arial" w:hAnsi="Arial" w:cs="Arial"/>
+                <w:sz w:val="19"/>
+                <w:szCs w:val="19"/>
+              </w:rPr>
+              <w:t>Quinta vez que aparece el nombre literal en el proyecto.</w:t>
+            </w:r>
+          </w:p>
         </w:tc>
       </w:tr>
     </w:tbl>
@@ -7185,7 +8469,21 @@
               <w:right w:w="100" w:type="dxa"/>
             </w:tcMar>
           </w:tcPr>
-          <w:p/>
+          <w:p>
+            <w:pPr>
+              <w:rPr>
+                <w:sz w:val="19"/>
+                <w:szCs w:val="19"/>
+              </w:rPr>
+            </w:pPr>
+            <w:r>
+              <w:rPr>
+                <w:sz w:val="19"/>
+                <w:szCs w:val="19"/>
+              </w:rPr>
+              <w:t>Todo el proyecto</w:t>
+            </w:r>
+          </w:p>
         </w:tc>
         <w:tc>
           <w:tcPr>
@@ -7204,7 +8502,25 @@
               <w:right w:w="100" w:type="dxa"/>
             </w:tcMar>
           </w:tcPr>
-          <w:p/>
+          <w:p>
+            <w:pPr>
+              <w:pStyle w:val="NormalWeb"/>
+              <w:rPr>
+                <w:rFonts w:ascii="Arial" w:hAnsi="Arial" w:cs="Arial"/>
+                <w:sz w:val="19"/>
+                <w:szCs w:val="19"/>
+              </w:rPr>
+            </w:pPr>
+            <w:r>
+              <w:rPr>
+                <w:rStyle w:val="citation-109"/>
+                <w:rFonts w:ascii="Arial" w:hAnsi="Arial" w:cs="Arial"/>
+                <w:sz w:val="19"/>
+                <w:szCs w:val="19"/>
+              </w:rPr>
+              <w:t>Todo el código está alineado a la izquierda.</w:t>
+            </w:r>
+          </w:p>
         </w:tc>
       </w:tr>
       <w:tr>
@@ -7283,7 +8599,21 @@
               <w:right w:w="100" w:type="dxa"/>
             </w:tcMar>
           </w:tcPr>
-          <w:p/>
+          <w:p>
+            <w:pPr>
+              <w:rPr>
+                <w:sz w:val="19"/>
+                <w:szCs w:val="19"/>
+              </w:rPr>
+            </w:pPr>
+            <w:r>
+              <w:rPr>
+                <w:sz w:val="19"/>
+                <w:szCs w:val="19"/>
+              </w:rPr>
+              <w:t>Todo el proyecto</w:t>
+            </w:r>
+          </w:p>
         </w:tc>
         <w:tc>
           <w:tcPr>
@@ -7302,7 +8632,21 @@
               <w:right w:w="100" w:type="dxa"/>
             </w:tcMar>
           </w:tcPr>
-          <w:p/>
+          <w:p>
+            <w:pPr>
+              <w:rPr>
+                <w:sz w:val="19"/>
+                <w:szCs w:val="19"/>
+              </w:rPr>
+            </w:pPr>
+            <w:r>
+              <w:rPr>
+                <w:sz w:val="19"/>
+                <w:szCs w:val="19"/>
+              </w:rPr>
+              <w:t>A veces en la misma línea, a veces abajo, sin un estándar.</w:t>
+            </w:r>
+          </w:p>
         </w:tc>
       </w:tr>
       <w:tr>
@@ -7381,7 +8725,41 @@
               <w:right w:w="100" w:type="dxa"/>
             </w:tcMar>
           </w:tcPr>
-          <w:p/>
+          <w:p>
+            <w:pPr>
+              <w:rPr>
+                <w:sz w:val="19"/>
+                <w:szCs w:val="19"/>
+              </w:rPr>
+            </w:pPr>
+            <w:r>
+              <w:rPr>
+                <w:rStyle w:val="CdigoHTML"/>
+                <w:rFonts w:ascii="Arial" w:eastAsia="Arial" w:hAnsi="Arial" w:cs="Arial"/>
+                <w:sz w:val="19"/>
+                <w:szCs w:val="19"/>
+              </w:rPr>
+              <w:t>Proceso</w:t>
+            </w:r>
+            <w:r>
+              <w:rPr>
+                <w:sz w:val="19"/>
+                <w:szCs w:val="19"/>
+              </w:rPr>
+              <w:t xml:space="preserve">, </w:t>
+            </w:r>
+            <w:proofErr w:type="spellStart"/>
+            <w:r>
+              <w:rPr>
+                <w:rStyle w:val="CdigoHTML"/>
+                <w:rFonts w:ascii="Arial" w:eastAsia="Arial" w:hAnsi="Arial" w:cs="Arial"/>
+                <w:sz w:val="19"/>
+                <w:szCs w:val="19"/>
+              </w:rPr>
+              <w:t>Main</w:t>
+            </w:r>
+            <w:proofErr w:type="spellEnd"/>
+          </w:p>
         </w:tc>
         <w:tc>
           <w:tcPr>
@@ -7400,7 +8778,40 @@
               <w:right w:w="100" w:type="dxa"/>
             </w:tcMar>
           </w:tcPr>
-          <w:p/>
+          <w:p>
+            <w:pPr>
+              <w:rPr>
+                <w:sz w:val="19"/>
+                <w:szCs w:val="19"/>
+              </w:rPr>
+            </w:pPr>
+            <w:r>
+              <w:rPr>
+                <w:rStyle w:val="citation-107"/>
+                <w:sz w:val="19"/>
+                <w:szCs w:val="19"/>
+              </w:rPr>
+              <w:t xml:space="preserve">Uso </w:t>
+            </w:r>
+            <w:proofErr w:type="gramStart"/>
+            <w:r>
+              <w:rPr>
+                <w:rStyle w:val="citation-107"/>
+                <w:sz w:val="19"/>
+                <w:szCs w:val="19"/>
+              </w:rPr>
+              <w:t>de }</w:t>
+            </w:r>
+            <w:proofErr w:type="gramEnd"/>
+            <w:r>
+              <w:rPr>
+                <w:rStyle w:val="citation-107"/>
+                <w:sz w:val="19"/>
+                <w:szCs w:val="19"/>
+              </w:rPr>
+              <w:t>}} sin espacios, dificultando ver dónde termina cada bloque.</w:t>
+            </w:r>
+          </w:p>
         </w:tc>
       </w:tr>
       <w:tr>
@@ -7497,7 +8908,22 @@
               <w:right w:w="100" w:type="dxa"/>
             </w:tcMar>
           </w:tcPr>
-          <w:p/>
+          <w:p>
+            <w:pPr>
+              <w:jc w:val="center"/>
+              <w:rPr>
+                <w:sz w:val="19"/>
+                <w:szCs w:val="19"/>
+              </w:rPr>
+            </w:pPr>
+            <w:r>
+              <w:rPr>
+                <w:sz w:val="19"/>
+                <w:szCs w:val="19"/>
+              </w:rPr>
+              <w:t>Todo el proyecto</w:t>
+            </w:r>
+          </w:p>
         </w:tc>
         <w:tc>
           <w:tcPr>
@@ -7516,7 +8942,58 @@
               <w:right w:w="100" w:type="dxa"/>
             </w:tcMar>
           </w:tcPr>
-          <w:p/>
+          <w:p>
+            <w:pPr>
+              <w:rPr>
+                <w:sz w:val="19"/>
+                <w:szCs w:val="19"/>
+              </w:rPr>
+            </w:pPr>
+            <w:r>
+              <w:rPr>
+                <w:rStyle w:val="citation-106"/>
+                <w:sz w:val="19"/>
+                <w:szCs w:val="19"/>
+              </w:rPr>
+              <w:t xml:space="preserve">Ejemplo: </w:t>
+            </w:r>
+            <w:proofErr w:type="spellStart"/>
+            <w:r>
+              <w:rPr>
+                <w:rStyle w:val="citation-106"/>
+                <w:sz w:val="19"/>
+                <w:szCs w:val="19"/>
+              </w:rPr>
+              <w:t>int</w:t>
+            </w:r>
+            <w:proofErr w:type="spellEnd"/>
+            <w:r>
+              <w:rPr>
+                <w:rStyle w:val="citation-106"/>
+                <w:sz w:val="19"/>
+                <w:szCs w:val="19"/>
+              </w:rPr>
+              <w:t xml:space="preserve"> a=</w:t>
+            </w:r>
+            <w:proofErr w:type="gramStart"/>
+            <w:r>
+              <w:rPr>
+                <w:rStyle w:val="citation-106"/>
+                <w:sz w:val="19"/>
+                <w:szCs w:val="19"/>
+              </w:rPr>
+              <w:t>0;boolean</w:t>
+            </w:r>
+            <w:proofErr w:type="gramEnd"/>
+            <w:r>
+              <w:rPr>
+                <w:rStyle w:val="citation-106"/>
+                <w:sz w:val="19"/>
+                <w:szCs w:val="19"/>
+              </w:rPr>
+              <w:t xml:space="preserve"> b=true; en una sola línea.</w:t>
+            </w:r>
+          </w:p>
         </w:tc>
       </w:tr>
     </w:tbl>
@@ -9362,6 +10839,184 @@
     <w:uiPriority w:val="99"/>
     <w:rsid w:val="001E19C0"/>
   </w:style>
+  <w:style w:type="paragraph" w:styleId="NormalWeb">
+    <w:name w:val="Normal (Web)"/>
+    <w:basedOn w:val="Normal"/>
+    <w:uiPriority w:val="99"/>
+    <w:unhideWhenUsed/>
+    <w:rsid w:val="00831ECA"/>
+    <w:pPr>
+      <w:spacing w:before="100" w:beforeAutospacing="1" w:after="100" w:afterAutospacing="1"/>
+    </w:pPr>
+    <w:rPr>
+      <w:rFonts w:ascii="Times New Roman" w:eastAsia="Times New Roman" w:hAnsi="Times New Roman" w:cs="Times New Roman"/>
+      <w:sz w:val="24"/>
+      <w:szCs w:val="24"/>
+    </w:rPr>
+  </w:style>
+  <w:style w:type="character" w:customStyle="1" w:styleId="citation-139">
+    <w:name w:val="citation-139"/>
+    <w:basedOn w:val="Fuentedeprrafopredeter"/>
+    <w:rsid w:val="00831ECA"/>
+  </w:style>
+  <w:style w:type="character" w:customStyle="1" w:styleId="citation-138">
+    <w:name w:val="citation-138"/>
+    <w:basedOn w:val="Fuentedeprrafopredeter"/>
+    <w:rsid w:val="00831ECA"/>
+  </w:style>
+  <w:style w:type="character" w:customStyle="1" w:styleId="citation-137">
+    <w:name w:val="citation-137"/>
+    <w:basedOn w:val="Fuentedeprrafopredeter"/>
+    <w:rsid w:val="00831ECA"/>
+  </w:style>
+  <w:style w:type="character" w:customStyle="1" w:styleId="citation-136">
+    <w:name w:val="citation-136"/>
+    <w:basedOn w:val="Fuentedeprrafopredeter"/>
+    <w:rsid w:val="00831ECA"/>
+  </w:style>
+  <w:style w:type="character" w:customStyle="1" w:styleId="citation-135">
+    <w:name w:val="citation-135"/>
+    <w:basedOn w:val="Fuentedeprrafopredeter"/>
+    <w:rsid w:val="00831ECA"/>
+  </w:style>
+  <w:style w:type="character" w:customStyle="1" w:styleId="citation-134">
+    <w:name w:val="citation-134"/>
+    <w:basedOn w:val="Fuentedeprrafopredeter"/>
+    <w:rsid w:val="00831ECA"/>
+  </w:style>
+  <w:style w:type="character" w:customStyle="1" w:styleId="citation-133">
+    <w:name w:val="citation-133"/>
+    <w:basedOn w:val="Fuentedeprrafopredeter"/>
+    <w:rsid w:val="003D29F5"/>
+  </w:style>
+  <w:style w:type="character" w:customStyle="1" w:styleId="citation-132">
+    <w:name w:val="citation-132"/>
+    <w:basedOn w:val="Fuentedeprrafopredeter"/>
+    <w:rsid w:val="003D29F5"/>
+  </w:style>
+  <w:style w:type="character" w:customStyle="1" w:styleId="citation-131">
+    <w:name w:val="citation-131"/>
+    <w:basedOn w:val="Fuentedeprrafopredeter"/>
+    <w:rsid w:val="003D29F5"/>
+  </w:style>
+  <w:style w:type="character" w:customStyle="1" w:styleId="citation-130">
+    <w:name w:val="citation-130"/>
+    <w:basedOn w:val="Fuentedeprrafopredeter"/>
+    <w:rsid w:val="003D29F5"/>
+  </w:style>
+  <w:style w:type="character" w:customStyle="1" w:styleId="citation-129">
+    <w:name w:val="citation-129"/>
+    <w:basedOn w:val="Fuentedeprrafopredeter"/>
+    <w:rsid w:val="003D29F5"/>
+  </w:style>
+  <w:style w:type="character" w:customStyle="1" w:styleId="citation-128">
+    <w:name w:val="citation-128"/>
+    <w:basedOn w:val="Fuentedeprrafopredeter"/>
+    <w:rsid w:val="003D29F5"/>
+  </w:style>
+  <w:style w:type="character" w:customStyle="1" w:styleId="citation-127">
+    <w:name w:val="citation-127"/>
+    <w:basedOn w:val="Fuentedeprrafopredeter"/>
+    <w:rsid w:val="003D29F5"/>
+  </w:style>
+  <w:style w:type="character" w:customStyle="1" w:styleId="citation-126">
+    <w:name w:val="citation-126"/>
+    <w:basedOn w:val="Fuentedeprrafopredeter"/>
+    <w:rsid w:val="003D29F5"/>
+  </w:style>
+  <w:style w:type="character" w:customStyle="1" w:styleId="citation-125">
+    <w:name w:val="citation-125"/>
+    <w:basedOn w:val="Fuentedeprrafopredeter"/>
+    <w:rsid w:val="003D29F5"/>
+  </w:style>
+  <w:style w:type="character" w:customStyle="1" w:styleId="citation-123">
+    <w:name w:val="citation-123"/>
+    <w:basedOn w:val="Fuentedeprrafopredeter"/>
+    <w:rsid w:val="003D29F5"/>
+  </w:style>
+  <w:style w:type="character" w:customStyle="1" w:styleId="citation-122">
+    <w:name w:val="citation-122"/>
+    <w:basedOn w:val="Fuentedeprrafopredeter"/>
+    <w:rsid w:val="003D29F5"/>
+  </w:style>
+  <w:style w:type="character" w:customStyle="1" w:styleId="citation-121">
+    <w:name w:val="citation-121"/>
+    <w:basedOn w:val="Fuentedeprrafopredeter"/>
+    <w:rsid w:val="003D29F5"/>
+  </w:style>
+  <w:style w:type="character" w:customStyle="1" w:styleId="citation-120">
+    <w:name w:val="citation-120"/>
+    <w:basedOn w:val="Fuentedeprrafopredeter"/>
+    <w:rsid w:val="003D29F5"/>
+  </w:style>
+  <w:style w:type="character" w:customStyle="1" w:styleId="citation-118">
+    <w:name w:val="citation-118"/>
+    <w:basedOn w:val="Fuentedeprrafopredeter"/>
+    <w:rsid w:val="003D29F5"/>
+  </w:style>
+  <w:style w:type="character" w:customStyle="1" w:styleId="citation-117">
+    <w:name w:val="citation-117"/>
+    <w:basedOn w:val="Fuentedeprrafopredeter"/>
+    <w:rsid w:val="003D29F5"/>
+  </w:style>
+  <w:style w:type="character" w:customStyle="1" w:styleId="citation-116">
+    <w:name w:val="citation-116"/>
+    <w:basedOn w:val="Fuentedeprrafopredeter"/>
+    <w:rsid w:val="003D29F5"/>
+  </w:style>
+  <w:style w:type="character" w:customStyle="1" w:styleId="citation-115">
+    <w:name w:val="citation-115"/>
+    <w:basedOn w:val="Fuentedeprrafopredeter"/>
+    <w:rsid w:val="00486FE2"/>
+  </w:style>
+  <w:style w:type="character" w:customStyle="1" w:styleId="citation-114">
+    <w:name w:val="citation-114"/>
+    <w:basedOn w:val="Fuentedeprrafopredeter"/>
+    <w:rsid w:val="00486FE2"/>
+  </w:style>
+  <w:style w:type="character" w:customStyle="1" w:styleId="citation-113">
+    <w:name w:val="citation-113"/>
+    <w:basedOn w:val="Fuentedeprrafopredeter"/>
+    <w:rsid w:val="00486FE2"/>
+  </w:style>
+  <w:style w:type="character" w:customStyle="1" w:styleId="citation-112">
+    <w:name w:val="citation-112"/>
+    <w:basedOn w:val="Fuentedeprrafopredeter"/>
+    <w:rsid w:val="00486FE2"/>
+  </w:style>
+  <w:style w:type="character" w:styleId="CdigoHTML">
+    <w:name w:val="HTML Code"/>
+    <w:basedOn w:val="Fuentedeprrafopredeter"/>
+    <w:uiPriority w:val="99"/>
+    <w:semiHidden/>
+    <w:unhideWhenUsed/>
+    <w:rsid w:val="00486FE2"/>
+    <w:rPr>
+      <w:rFonts w:ascii="Courier New" w:eastAsia="Times New Roman" w:hAnsi="Courier New" w:cs="Courier New"/>
+      <w:sz w:val="20"/>
+      <w:szCs w:val="20"/>
+    </w:rPr>
+  </w:style>
+  <w:style w:type="character" w:customStyle="1" w:styleId="citation-110">
+    <w:name w:val="citation-110"/>
+    <w:basedOn w:val="Fuentedeprrafopredeter"/>
+    <w:rsid w:val="00486FE2"/>
+  </w:style>
+  <w:style w:type="character" w:customStyle="1" w:styleId="citation-109">
+    <w:name w:val="citation-109"/>
+    <w:basedOn w:val="Fuentedeprrafopredeter"/>
+    <w:rsid w:val="00486FE2"/>
+  </w:style>
+  <w:style w:type="character" w:customStyle="1" w:styleId="citation-107">
+    <w:name w:val="citation-107"/>
+    <w:basedOn w:val="Fuentedeprrafopredeter"/>
+    <w:rsid w:val="00486FE2"/>
+  </w:style>
+  <w:style w:type="character" w:customStyle="1" w:styleId="citation-106">
+    <w:name w:val="citation-106"/>
+    <w:basedOn w:val="Fuentedeprrafopredeter"/>
+    <w:rsid w:val="00486FE2"/>
+  </w:style>
 </w:styles>
 </file>
 

</xml_diff>